<commit_message>
ajustes no cv jan 2026
</commit_message>
<xml_diff>
--- a/cv_2025.docx
+++ b/cv_2025.docx
@@ -63,46 +63,56 @@
         </w:rPr>
         <w:t xml:space="preserve">Vila Romana, São Paulo – SP | 5511959473402 | </w:t>
       </w:r>
+      <w:r>
+        <w:fldChar w:fldCharType="begin"/>
+      </w:r>
+      <w:r>
+        <w:instrText>HYPERLINK "mailto:minoruyamanaka@icloud.com"</w:instrText>
+      </w:r>
+      <w:r>
+        <w:fldChar w:fldCharType="separate"/>
+      </w:r>
+      <w:r>
+        <w:rPr>
+          <w:rStyle w:val="Hyperlink"/>
+          <w:bCs/>
+          <w:sz w:val="20"/>
+          <w:szCs w:val="20"/>
+        </w:rPr>
+        <w:t>minoruyamanaka@icloud.com</w:t>
+      </w:r>
+      <w:r>
+        <w:fldChar w:fldCharType="end"/>
+      </w:r>
+    </w:p>
+    <w:p>
+      <w:pPr>
+        <w:jc w:val="center"/>
+        <w:rPr>
+          <w:bCs/>
+          <w:sz w:val="20"/>
+          <w:szCs w:val="20"/>
+        </w:rPr>
+      </w:pPr>
+      <w:r>
+        <w:rPr>
+          <w:bCs/>
+          <w:sz w:val="20"/>
+          <w:szCs w:val="20"/>
+        </w:rPr>
+        <w:t>Aceito proposta para trabalhar como CLT ou PJ – Presencial e Home Office</w:t>
+      </w:r>
+    </w:p>
+    <w:p>
+      <w:pPr>
+        <w:jc w:val="center"/>
+        <w:rPr>
+          <w:bCs/>
+          <w:sz w:val="20"/>
+          <w:szCs w:val="20"/>
+        </w:rPr>
+      </w:pPr>
       <w:hyperlink r:id="rId7" w:history="1">
-        <w:r>
-          <w:rPr>
-            <w:rStyle w:val="Hyperlink"/>
-            <w:bCs/>
-            <w:sz w:val="20"/>
-            <w:szCs w:val="20"/>
-          </w:rPr>
-          <w:t>minoruyamanaka@icloud.com</w:t>
-        </w:r>
-      </w:hyperlink>
-    </w:p>
-    <w:p>
-      <w:pPr>
-        <w:jc w:val="center"/>
-        <w:rPr>
-          <w:bCs/>
-          <w:sz w:val="20"/>
-          <w:szCs w:val="20"/>
-        </w:rPr>
-      </w:pPr>
-      <w:r>
-        <w:rPr>
-          <w:bCs/>
-          <w:sz w:val="20"/>
-          <w:szCs w:val="20"/>
-        </w:rPr>
-        <w:t>Aceito proposta para trabalhar como CLT ou PJ – Presencial e Home Office</w:t>
-      </w:r>
-    </w:p>
-    <w:p>
-      <w:pPr>
-        <w:jc w:val="center"/>
-        <w:rPr>
-          <w:bCs/>
-          <w:sz w:val="20"/>
-          <w:szCs w:val="20"/>
-        </w:rPr>
-      </w:pPr>
-      <w:hyperlink r:id="rId8" w:history="1">
         <w:r>
           <w:rPr>
             <w:rStyle w:val="Hyperlink"/>
@@ -121,17 +131,27 @@
         </w:rPr>
         <w:t xml:space="preserve"> | </w:t>
       </w:r>
-      <w:hyperlink r:id="rId9" w:history="1">
-        <w:r>
-          <w:rPr>
-            <w:rStyle w:val="Hyperlink"/>
-            <w:bCs/>
-            <w:sz w:val="20"/>
-            <w:szCs w:val="20"/>
-          </w:rPr>
-          <w:t>linkedin.com/in/minoru-yamanaka</w:t>
-        </w:r>
-      </w:hyperlink>
+      <w:r>
+        <w:fldChar w:fldCharType="begin"/>
+      </w:r>
+      <w:r>
+        <w:instrText>HYPERLINK "https://www.linkedin.com/in/minoru-yamanaka"</w:instrText>
+      </w:r>
+      <w:r>
+        <w:fldChar w:fldCharType="separate"/>
+      </w:r>
+      <w:r>
+        <w:rPr>
+          <w:rStyle w:val="Hyperlink"/>
+          <w:bCs/>
+          <w:sz w:val="20"/>
+          <w:szCs w:val="20"/>
+        </w:rPr>
+        <w:t>linkedin.com/in/minoru-yamanaka</w:t>
+      </w:r>
+      <w:r>
+        <w:fldChar w:fldCharType="end"/>
+      </w:r>
     </w:p>
     <w:p>
       <w:pPr>
@@ -364,7 +384,107 @@
           <w:szCs w:val="20"/>
           <w:lang w:val="pt-BR"/>
         </w:rPr>
-        <w:t>Algumas das minhas habilidades técnicas incluem programação em Java, Python e SQL, além de desenvolvimento front-end com HTML, CSS e JavaScript. Possuo conhecimento em Power BI, MySQL, Git, Figma e metodologias ágeis (Scrum e Kanban), além de certificações em Data Science, Big Data e Power BI.</w:t>
+        <w:t>Algumas das minhas habilidades técnicas incluem programação em Java, Python e SQL, além de desenvolvimento front-</w:t>
+      </w:r>
+      <w:proofErr w:type="spellStart"/>
+      <w:r>
+        <w:rPr>
+          <w:color w:val="000000"/>
+          <w:sz w:val="20"/>
+          <w:szCs w:val="20"/>
+          <w:lang w:val="pt-BR"/>
+        </w:rPr>
+        <w:t>end</w:t>
+      </w:r>
+      <w:proofErr w:type="spellEnd"/>
+      <w:r>
+        <w:rPr>
+          <w:color w:val="000000"/>
+          <w:sz w:val="20"/>
+          <w:szCs w:val="20"/>
+          <w:lang w:val="pt-BR"/>
+        </w:rPr>
+        <w:t xml:space="preserve"> com HTML, CSS e </w:t>
+      </w:r>
+      <w:proofErr w:type="spellStart"/>
+      <w:r>
+        <w:rPr>
+          <w:color w:val="000000"/>
+          <w:sz w:val="20"/>
+          <w:szCs w:val="20"/>
+          <w:lang w:val="pt-BR"/>
+        </w:rPr>
+        <w:t>JavaScript</w:t>
+      </w:r>
+      <w:proofErr w:type="spellEnd"/>
+      <w:r>
+        <w:rPr>
+          <w:color w:val="000000"/>
+          <w:sz w:val="20"/>
+          <w:szCs w:val="20"/>
+          <w:lang w:val="pt-BR"/>
+        </w:rPr>
+        <w:t xml:space="preserve">. Possuo conhecimento em Power BI, MySQL, </w:t>
+      </w:r>
+      <w:proofErr w:type="spellStart"/>
+      <w:r>
+        <w:rPr>
+          <w:color w:val="000000"/>
+          <w:sz w:val="20"/>
+          <w:szCs w:val="20"/>
+          <w:lang w:val="pt-BR"/>
+        </w:rPr>
+        <w:t>Git</w:t>
+      </w:r>
+      <w:proofErr w:type="spellEnd"/>
+      <w:r>
+        <w:rPr>
+          <w:color w:val="000000"/>
+          <w:sz w:val="20"/>
+          <w:szCs w:val="20"/>
+          <w:lang w:val="pt-BR"/>
+        </w:rPr>
+        <w:t xml:space="preserve">, </w:t>
+      </w:r>
+      <w:proofErr w:type="spellStart"/>
+      <w:r>
+        <w:rPr>
+          <w:color w:val="000000"/>
+          <w:sz w:val="20"/>
+          <w:szCs w:val="20"/>
+          <w:lang w:val="pt-BR"/>
+        </w:rPr>
+        <w:t>Figma</w:t>
+      </w:r>
+      <w:proofErr w:type="spellEnd"/>
+      <w:r>
+        <w:rPr>
+          <w:color w:val="000000"/>
+          <w:sz w:val="20"/>
+          <w:szCs w:val="20"/>
+          <w:lang w:val="pt-BR"/>
+        </w:rPr>
+        <w:t xml:space="preserve"> e metodologias ágeis (Scrum e </w:t>
+      </w:r>
+      <w:proofErr w:type="spellStart"/>
+      <w:r>
+        <w:rPr>
+          <w:color w:val="000000"/>
+          <w:sz w:val="20"/>
+          <w:szCs w:val="20"/>
+          <w:lang w:val="pt-BR"/>
+        </w:rPr>
+        <w:t>Kanban</w:t>
+      </w:r>
+      <w:proofErr w:type="spellEnd"/>
+      <w:r>
+        <w:rPr>
+          <w:color w:val="000000"/>
+          <w:sz w:val="20"/>
+          <w:szCs w:val="20"/>
+          <w:lang w:val="pt-BR"/>
+        </w:rPr>
+        <w:t>), além de certificações em Data Science, Big Data e Power BI.</w:t>
       </w:r>
       <w:r>
         <w:rPr>
@@ -594,7 +714,47 @@
           <w:szCs w:val="20"/>
           <w:lang w:val="pt-BR"/>
         </w:rPr>
-        <w:t>Sou apaixonado por tecnologia, inovação e gestão de projetos. Busco oportunidades nas áreas de Desenvolvimento Web, Front-End Development, Gestão de Projetos (PMO) ou Recrutamento Tech, onde possa aplicar e aprimorar meus conhecimentos técnicos e estratégicos.</w:t>
+        <w:t>Sou apaixonado por tecnologia, inovação e gestão de projetos. Busco oportunidades nas áreas de Desenvolvimento Web, Front-</w:t>
+      </w:r>
+      <w:proofErr w:type="spellStart"/>
+      <w:r>
+        <w:rPr>
+          <w:color w:val="000000"/>
+          <w:sz w:val="20"/>
+          <w:szCs w:val="20"/>
+          <w:lang w:val="pt-BR"/>
+        </w:rPr>
+        <w:t>End</w:t>
+      </w:r>
+      <w:proofErr w:type="spellEnd"/>
+      <w:r>
+        <w:rPr>
+          <w:color w:val="000000"/>
+          <w:sz w:val="20"/>
+          <w:szCs w:val="20"/>
+          <w:lang w:val="pt-BR"/>
+        </w:rPr>
+        <w:t xml:space="preserve"> </w:t>
+      </w:r>
+      <w:proofErr w:type="spellStart"/>
+      <w:r>
+        <w:rPr>
+          <w:color w:val="000000"/>
+          <w:sz w:val="20"/>
+          <w:szCs w:val="20"/>
+          <w:lang w:val="pt-BR"/>
+        </w:rPr>
+        <w:t>Development</w:t>
+      </w:r>
+      <w:proofErr w:type="spellEnd"/>
+      <w:r>
+        <w:rPr>
+          <w:color w:val="000000"/>
+          <w:sz w:val="20"/>
+          <w:szCs w:val="20"/>
+          <w:lang w:val="pt-BR"/>
+        </w:rPr>
+        <w:t>, Gestão de Projetos (PMO) ou Recrutamento Tech, onde possa aplicar e aprimorar meus conhecimentos técnicos e estratégicos.</w:t>
       </w:r>
     </w:p>
     <w:p>
@@ -1666,6 +1826,16 @@
     <w:p>
       <w:pPr>
         <w:pStyle w:val="PargrafodaLista"/>
+        <w:jc w:val="both"/>
+        <w:rPr>
+          <w:sz w:val="20"/>
+          <w:szCs w:val="20"/>
+        </w:rPr>
+      </w:pPr>
+    </w:p>
+    <w:p>
+      <w:pPr>
+        <w:pStyle w:val="PargrafodaLista"/>
         <w:ind w:left="0"/>
         <w:jc w:val="both"/>
         <w:rPr>
@@ -1678,10 +1848,47 @@
       <w:pPr>
         <w:pStyle w:val="Ttulo1"/>
         <w:ind w:left="0"/>
-        <w:jc w:val="both"/>
+        <w:rPr>
+          <w:rStyle w:val="Hyperlink"/>
+          <w:b w:val="0"/>
+          <w:bCs/>
+          <w:color w:val="auto"/>
+          <w:u w:val="none"/>
+        </w:rPr>
       </w:pPr>
       <w:r>
         <w:t>CURSO | CERTIFICAÇÃO</w:t>
+      </w:r>
+      <w:r>
+        <w:rPr>
+          <w:b w:val="0"/>
+          <w:bCs/>
+          <w:lang w:val="pt-BR"/>
+        </w:rPr>
+        <w:fldChar w:fldCharType="begin"/>
+      </w:r>
+      <w:r>
+        <w:rPr>
+          <w:b w:val="0"/>
+          <w:bCs/>
+          <w:lang w:val="pt-BR"/>
+        </w:rPr>
+        <w:instrText>HYPERLINK "https://github.com/minoru-yamanaka/cv/blob/main/certificados/ASSISTENTES_DE_PESQUISA_COM_GPTS_PERSONALIZADOS_NO_CHATGPT_E_NOTEBOOKLM.pdf" \t "_self"</w:instrText>
+      </w:r>
+      <w:r>
+        <w:rPr>
+          <w:b w:val="0"/>
+          <w:bCs/>
+          <w:lang w:val="pt-BR"/>
+        </w:rPr>
+      </w:r>
+      <w:r>
+        <w:rPr>
+          <w:b w:val="0"/>
+          <w:bCs/>
+          <w:lang w:val="pt-BR"/>
+        </w:rPr>
+        <w:fldChar w:fldCharType="separate"/>
       </w:r>
     </w:p>
     <w:p>
@@ -1691,87 +1898,115 @@
           <w:ilvl w:val="0"/>
           <w:numId w:val="24"/>
         </w:numPr>
-        <w:jc w:val="both"/>
-        <w:rPr>
-          <w:sz w:val="20"/>
-          <w:szCs w:val="20"/>
-        </w:rPr>
-      </w:pPr>
-      <w:r>
-        <w:rPr>
-          <w:sz w:val="20"/>
-          <w:szCs w:val="20"/>
-        </w:rPr>
-        <w:t xml:space="preserve">Desenvolvedor </w:t>
-      </w:r>
-      <w:r>
-        <w:rPr>
-          <w:sz w:val="20"/>
-          <w:szCs w:val="20"/>
-        </w:rPr>
-        <w:t>Back</w:t>
-      </w:r>
-      <w:r>
-        <w:rPr>
-          <w:sz w:val="20"/>
-          <w:szCs w:val="20"/>
-        </w:rPr>
-        <w:t xml:space="preserve">-End (SENAC Lapa Tito) - </w:t>
-      </w:r>
-      <w:r>
-        <w:rPr>
-          <w:sz w:val="20"/>
-          <w:szCs w:val="20"/>
-        </w:rPr>
-        <w:t>500</w:t>
-      </w:r>
-      <w:r>
-        <w:rPr>
-          <w:sz w:val="20"/>
-          <w:szCs w:val="20"/>
-        </w:rPr>
+      </w:pPr>
+      <w:r>
+        <w:rPr>
+          <w:rStyle w:val="Hyperlink"/>
+          <w:bCs/>
+          <w:color w:val="auto"/>
+          <w:sz w:val="20"/>
+          <w:szCs w:val="20"/>
+          <w:u w:val="none"/>
+          <w:lang w:val="pt-BR"/>
+        </w:rPr>
+        <w:t>Criação de assistentes</w:t>
+      </w:r>
+      <w:r>
+        <w:rPr>
+          <w:rStyle w:val="Hyperlink"/>
+          <w:bCs/>
+          <w:color w:val="auto"/>
+          <w:sz w:val="20"/>
+          <w:szCs w:val="20"/>
+          <w:u w:val="none"/>
+          <w:lang w:val="pt-BR"/>
+        </w:rPr>
+        <w:t xml:space="preserve"> </w:t>
+      </w:r>
+      <w:r>
+        <w:rPr>
+          <w:rStyle w:val="Hyperlink"/>
+          <w:bCs/>
+          <w:color w:val="auto"/>
+          <w:sz w:val="20"/>
+          <w:szCs w:val="20"/>
+          <w:u w:val="none"/>
+          <w:lang w:val="pt-BR"/>
+        </w:rPr>
+        <w:t>personalizados no ChatGPT e</w:t>
+      </w:r>
+      <w:r>
+        <w:rPr>
+          <w:rStyle w:val="Hyperlink"/>
+          <w:bCs/>
+          <w:color w:val="auto"/>
+          <w:sz w:val="20"/>
+          <w:szCs w:val="20"/>
+          <w:u w:val="none"/>
+          <w:lang w:val="pt-BR"/>
+        </w:rPr>
+        <w:t xml:space="preserve"> </w:t>
+      </w:r>
+      <w:proofErr w:type="spellStart"/>
+      <w:r>
+        <w:rPr>
+          <w:rStyle w:val="Hyperlink"/>
+          <w:bCs/>
+          <w:color w:val="auto"/>
+          <w:sz w:val="20"/>
+          <w:szCs w:val="20"/>
+          <w:u w:val="none"/>
+          <w:lang w:val="pt-BR"/>
+        </w:rPr>
+        <w:t>NotebookLM</w:t>
+      </w:r>
+      <w:proofErr w:type="spellEnd"/>
+      <w:r>
+        <w:rPr>
+          <w:bCs/>
+        </w:rPr>
+        <w:fldChar w:fldCharType="end"/>
+      </w:r>
+      <w:r>
+        <w:rPr>
+          <w:bCs/>
+        </w:rPr>
+        <w:t xml:space="preserve"> </w:t>
+      </w:r>
+      <w:r>
+        <w:t>(</w:t>
+      </w:r>
+      <w:r>
+        <w:t>Mackenzie</w:t>
+      </w:r>
+      <w:r>
+        <w:t xml:space="preserve">) - </w:t>
+      </w:r>
+      <w:r>
+        <w:t>4</w:t>
+      </w:r>
+      <w:r>
         <w:t>h</w:t>
       </w:r>
       <w:r>
-        <w:rPr>
-          <w:sz w:val="20"/>
-          <w:szCs w:val="20"/>
-        </w:rPr>
         <w:t xml:space="preserve"> (0</w:t>
       </w:r>
       <w:r>
-        <w:rPr>
-          <w:sz w:val="20"/>
-          <w:szCs w:val="20"/>
-        </w:rPr>
-        <w:t>9</w:t>
-      </w:r>
-      <w:r>
-        <w:rPr>
-          <w:sz w:val="20"/>
-          <w:szCs w:val="20"/>
-        </w:rPr>
+        <w:t>1</w:t>
+      </w:r>
+      <w:r>
         <w:t>/</w:t>
       </w:r>
       <w:r>
-        <w:rPr>
-          <w:sz w:val="20"/>
-          <w:szCs w:val="20"/>
-        </w:rPr>
-        <w:t>2025</w:t>
-      </w:r>
-      <w:r>
-        <w:rPr>
-          <w:sz w:val="20"/>
-          <w:szCs w:val="20"/>
-        </w:rPr>
+        <w:t>202</w:t>
+      </w:r>
+      <w:r>
+        <w:t>6</w:t>
+      </w:r>
+      <w:r>
         <w:t>)</w:t>
       </w:r>
       <w:r>
-        <w:rPr>
-          <w:sz w:val="20"/>
-          <w:szCs w:val="20"/>
-        </w:rPr>
         <w:t>.</w:t>
       </w:r>
     </w:p>
@@ -1793,14 +2028,42 @@
           <w:sz w:val="20"/>
           <w:szCs w:val="20"/>
         </w:rPr>
-        <w:t>Desenvolvedor Front-End (SENAC Lapa Tito) - 264h</w:t>
-      </w:r>
-      <w:r>
-        <w:rPr>
-          <w:sz w:val="20"/>
-          <w:szCs w:val="20"/>
-        </w:rPr>
-        <w:t xml:space="preserve"> (06/</w:t>
+        <w:t xml:space="preserve">Desenvolvedor </w:t>
+      </w:r>
+      <w:r>
+        <w:rPr>
+          <w:sz w:val="20"/>
+          <w:szCs w:val="20"/>
+        </w:rPr>
+        <w:t>Back</w:t>
+      </w:r>
+      <w:r>
+        <w:rPr>
+          <w:sz w:val="20"/>
+          <w:szCs w:val="20"/>
+        </w:rPr>
+        <w:t xml:space="preserve">-End (SENAC Lapa Tito) - </w:t>
+      </w:r>
+      <w:r>
+        <w:rPr>
+          <w:sz w:val="20"/>
+          <w:szCs w:val="20"/>
+        </w:rPr>
+        <w:t>500</w:t>
+      </w:r>
+      <w:r>
+        <w:rPr>
+          <w:sz w:val="20"/>
+          <w:szCs w:val="20"/>
+        </w:rPr>
+        <w:t>h</w:t>
+      </w:r>
+      <w:r>
+        <w:rPr>
+          <w:sz w:val="20"/>
+          <w:szCs w:val="20"/>
+        </w:rPr>
+        <w:t xml:space="preserve"> (09/</w:t>
       </w:r>
       <w:r>
         <w:rPr>
@@ -1842,7 +2105,35 @@
           <w:sz w:val="20"/>
           <w:szCs w:val="20"/>
         </w:rPr>
-        <w:t>Banco de Dados para Data Science (SENAI Nadir Dias de Figueiredo) - 40h (09/2024)</w:t>
+        <w:t>Desenvolvedor Front-End (SENAC Lapa Tito) - 264h</w:t>
+      </w:r>
+      <w:r>
+        <w:rPr>
+          <w:sz w:val="20"/>
+          <w:szCs w:val="20"/>
+        </w:rPr>
+        <w:t xml:space="preserve"> (06/</w:t>
+      </w:r>
+      <w:r>
+        <w:rPr>
+          <w:sz w:val="20"/>
+          <w:szCs w:val="20"/>
+        </w:rPr>
+        <w:t>2025</w:t>
+      </w:r>
+      <w:r>
+        <w:rPr>
+          <w:sz w:val="20"/>
+          <w:szCs w:val="20"/>
+        </w:rPr>
+        <w:t>)</w:t>
+      </w:r>
+      <w:r>
+        <w:rPr>
+          <w:sz w:val="20"/>
+          <w:szCs w:val="20"/>
+        </w:rPr>
+        <w:t>.</w:t>
       </w:r>
     </w:p>
     <w:p>
@@ -1863,7 +2154,7 @@
           <w:sz w:val="20"/>
           <w:szCs w:val="20"/>
         </w:rPr>
-        <w:t>Microsoft Office Excel (SENAI Nadir Dias de Figueiredo) – 20h (08/2024)</w:t>
+        <w:t>Banco de Dados para Data Science (SENAI Nadir Dias de Figueiredo) - 40h (09/2024)</w:t>
       </w:r>
     </w:p>
     <w:p>
@@ -1884,7 +2175,7 @@
           <w:sz w:val="20"/>
           <w:szCs w:val="20"/>
         </w:rPr>
-        <w:t>Implementação em Big Data (SENAI Roberto Simonsen) - 40h (08/2024)</w:t>
+        <w:t>Microsoft Office Excel (SENAI Nadir Dias de Figueiredo) – 20h (08/2024)</w:t>
       </w:r>
     </w:p>
     <w:p>
@@ -1905,7 +2196,7 @@
           <w:sz w:val="20"/>
           <w:szCs w:val="20"/>
         </w:rPr>
-        <w:t>Programação em Python para Data Science (SENAI Ary Torres) - 60h (08/2024)</w:t>
+        <w:t>Implementação em Big Data (SENAI Roberto Simonsen) - 40h (08/2024)</w:t>
       </w:r>
     </w:p>
     <w:p>
@@ -1926,7 +2217,7 @@
           <w:sz w:val="20"/>
           <w:szCs w:val="20"/>
         </w:rPr>
-        <w:t>Design Centrado no Usuário (PUCRS) - 10h (07/2024)</w:t>
+        <w:t>Programação em Python para Data Science (SENAI Ary Torres) - 60h (08/2024)</w:t>
       </w:r>
     </w:p>
     <w:p>
@@ -1947,7 +2238,7 @@
           <w:sz w:val="20"/>
           <w:szCs w:val="20"/>
         </w:rPr>
-        <w:t>Compliance e Proteção de Dados (PUCRS) - 10h (07/2024)</w:t>
+        <w:t>Design Centrado no Usuário (PUCRS) - 10h (07/2024)</w:t>
       </w:r>
     </w:p>
     <w:p>
@@ -1968,7 +2259,7 @@
           <w:sz w:val="20"/>
           <w:szCs w:val="20"/>
         </w:rPr>
-        <w:t>Soluções Ágeis (SEBRAE) - 24h (07/2024)</w:t>
+        <w:t>Compliance e Proteção de Dados (PUCRS) - 10h (07/2024)</w:t>
       </w:r>
     </w:p>
     <w:p>
@@ -1989,7 +2280,7 @@
           <w:sz w:val="20"/>
           <w:szCs w:val="20"/>
         </w:rPr>
-        <w:t>Gestão de Recursos Humanos (SEBRAE) - 15h (07/2024)</w:t>
+        <w:t>Soluções Ágeis (SEBRAE) - 24h (07/2024)</w:t>
       </w:r>
     </w:p>
     <w:p>
@@ -2010,7 +2301,7 @@
           <w:sz w:val="20"/>
           <w:szCs w:val="20"/>
         </w:rPr>
-        <w:t>Introdução à Ciência de Dados (FGV) - 60h (07/2024)</w:t>
+        <w:t>Gestão de Recursos Humanos (SEBRAE) - 15h (07/2024)</w:t>
       </w:r>
     </w:p>
     <w:p>
@@ -2031,7 +2322,7 @@
           <w:sz w:val="20"/>
           <w:szCs w:val="20"/>
         </w:rPr>
-        <w:t>Power BI (SENAI Orlando Laviero Ferraiuolo) - 20h (06/2024)</w:t>
+        <w:t>Introdução à Ciência de Dados (FGV) - 60h (07/2024)</w:t>
       </w:r>
     </w:p>
     <w:p>
@@ -2052,7 +2343,7 @@
           <w:sz w:val="20"/>
           <w:szCs w:val="20"/>
         </w:rPr>
-        <w:t>Programação em Python (SENAI José Ephim Mindlin) - 120h (04/2024)</w:t>
+        <w:t>Power BI (SENAI Orlando Laviero Ferraiuolo) - 20h (06/2024)</w:t>
       </w:r>
     </w:p>
     <w:p>
@@ -2073,7 +2364,7 @@
           <w:sz w:val="20"/>
           <w:szCs w:val="20"/>
         </w:rPr>
-        <w:t>Web Design, Front End (SENAI Roberto Simonsen) - 180h (04/2024)</w:t>
+        <w:t>Programação em Python (SENAI José Ephim Mindlin) - 120h (04/2024)</w:t>
       </w:r>
     </w:p>
     <w:p>
@@ -2094,7 +2385,7 @@
           <w:sz w:val="20"/>
           <w:szCs w:val="20"/>
         </w:rPr>
-        <w:t>Programação Oracle, Java Foundations (SENAI Mariano Ferraz) - 120h (12/2023)</w:t>
+        <w:t>Web Design, Front End (SENAI Roberto Simonsen) - 180h (04/2024)</w:t>
       </w:r>
     </w:p>
     <w:p>
@@ -2115,7 +2406,7 @@
           <w:sz w:val="20"/>
           <w:szCs w:val="20"/>
         </w:rPr>
-        <w:t>Desenvolvedor de Aplicações para Android (SENAI Mariano Ferraz) - 40h (12/2023)</w:t>
+        <w:t>Programação Oracle, Java Foundations (SENAI Mariano Ferraz) - 120h (12/2023)</w:t>
       </w:r>
     </w:p>
     <w:p>
@@ -2136,7 +2427,7 @@
           <w:sz w:val="20"/>
           <w:szCs w:val="20"/>
         </w:rPr>
-        <w:t>Java Foundations - 120h (12/2023)</w:t>
+        <w:t>Desenvolvedor de Aplicações para Android (SENAI Mariano Ferraz) - 40h (12/2023)</w:t>
       </w:r>
     </w:p>
     <w:p>
@@ -2157,7 +2448,7 @@
           <w:sz w:val="20"/>
           <w:szCs w:val="20"/>
         </w:rPr>
-        <w:t>Microsoft Power BI (Fundação Bradesco) - 5h (05/2023)</w:t>
+        <w:t>Java Foundations - 120h (12/2023)</w:t>
       </w:r>
     </w:p>
     <w:p>
@@ -2178,7 +2469,7 @@
           <w:sz w:val="20"/>
           <w:szCs w:val="20"/>
         </w:rPr>
-        <w:t>Google Fundamentos do Marketing Digital (Google) - 40h (04/2023)</w:t>
+        <w:t>Microsoft Power BI (Fundação Bradesco) - 5h (05/2023)</w:t>
       </w:r>
     </w:p>
     <w:p>
@@ -2199,7 +2490,7 @@
           <w:sz w:val="20"/>
           <w:szCs w:val="20"/>
         </w:rPr>
-        <w:t>Projetos de Sistemas de TI (Fundação Bradesco) - 15h (03/2023)</w:t>
+        <w:t>Google Fundamentos do Marketing Digital (Google) - 40h (04/2023)</w:t>
       </w:r>
     </w:p>
     <w:p>
@@ -2220,7 +2511,7 @@
           <w:sz w:val="20"/>
           <w:szCs w:val="20"/>
         </w:rPr>
-        <w:t>Inglês Instrumental - Universidade Cidade de São Paulo - 80h (12/2022)</w:t>
+        <w:t>Projetos de Sistemas de TI (Fundação Bradesco) - 15h (03/2023)</w:t>
       </w:r>
     </w:p>
     <w:p>
@@ -2241,7 +2532,7 @@
           <w:sz w:val="20"/>
           <w:szCs w:val="20"/>
         </w:rPr>
-        <w:t>Gestão de Tecnologia da Informação - Universidade Cidade de São Paulo - 60h (07/2023)</w:t>
+        <w:t>Inglês Instrumental - Universidade Cidade de São Paulo - 80h (12/2022)</w:t>
       </w:r>
     </w:p>
     <w:p>
@@ -2262,7 +2553,7 @@
           <w:sz w:val="20"/>
           <w:szCs w:val="20"/>
         </w:rPr>
-        <w:t>Governança Corporativa - Universidade Cidade de São Paulo - 60h (07/2023)</w:t>
+        <w:t>Gestão de Tecnologia da Informação - Universidade Cidade de São Paulo - 60h (07/2023)</w:t>
       </w:r>
     </w:p>
     <w:p>
@@ -2283,7 +2574,7 @@
           <w:sz w:val="20"/>
           <w:szCs w:val="20"/>
         </w:rPr>
-        <w:t>Java · Devmedia (09/2022)</w:t>
+        <w:t>Governança Corporativa - Universidade Cidade de São Paulo - 60h (07/2023)</w:t>
       </w:r>
     </w:p>
     <w:p>
@@ -2304,7 +2595,7 @@
           <w:sz w:val="20"/>
           <w:szCs w:val="20"/>
         </w:rPr>
-        <w:t>Programação – Devmedia (06/2022)</w:t>
+        <w:t>Java · Devmedia (09/2022)</w:t>
       </w:r>
     </w:p>
     <w:p>
@@ -2325,7 +2616,7 @@
           <w:sz w:val="20"/>
           <w:szCs w:val="20"/>
         </w:rPr>
-        <w:t>CSS - Devmedia (06/2022)</w:t>
+        <w:t>Programação – Devmedia (06/2022)</w:t>
       </w:r>
     </w:p>
     <w:p>
@@ -2346,6 +2637,27 @@
           <w:sz w:val="20"/>
           <w:szCs w:val="20"/>
         </w:rPr>
+        <w:t>CSS - Devmedia (06/2022)</w:t>
+      </w:r>
+    </w:p>
+    <w:p>
+      <w:pPr>
+        <w:pStyle w:val="PargrafodaLista"/>
+        <w:numPr>
+          <w:ilvl w:val="0"/>
+          <w:numId w:val="24"/>
+        </w:numPr>
+        <w:jc w:val="both"/>
+        <w:rPr>
+          <w:sz w:val="20"/>
+          <w:szCs w:val="20"/>
+        </w:rPr>
+      </w:pPr>
+      <w:r>
+        <w:rPr>
+          <w:sz w:val="20"/>
+          <w:szCs w:val="20"/>
+        </w:rPr>
         <w:t>HTML - Devmedia (06/2022)</w:t>
       </w:r>
     </w:p>
@@ -2455,7 +2767,7 @@
       </w:pPr>
     </w:p>
     <w:sectPr>
-      <w:headerReference w:type="default" r:id="rId10"/>
+      <w:headerReference w:type="default" r:id="rId8"/>
       <w:pgSz w:w="11910" w:h="16840"/>
       <w:pgMar w:top="1134" w:right="1134" w:bottom="1134" w:left="1134" w:header="0" w:footer="726" w:gutter="0"/>
       <w:pgNumType w:start="1"/>
@@ -6638,7 +6950,6 @@
   <w:style w:type="character" w:default="1" w:styleId="Fontepargpadro">
     <w:name w:val="Default Paragraph Font"/>
     <w:uiPriority w:val="1"/>
-    <w:semiHidden/>
     <w:unhideWhenUsed/>
   </w:style>
   <w:style w:type="table" w:default="1" w:styleId="Tabelanormal">

</xml_diff>